<commit_message>
Die Dokumente verweisen jetzt auf die Screenshot-Downloads
In jeder PDF-, Word- und Markdown-Fassung der Pressemitteilung steht
vor dem Abdruck-Hinweis, dass druckfaehige und weboptimierte
Screenshots auf der Website bereitstehen - verlinkt auf die jeweilige
Sprachversion der Mitteilungsseite. Die Pressekits sind entsprechend
neu gepackt.

Co-Authored-By: Claude Fable 5 <noreply@anthropic.com>
</commit_message>
<xml_diff>
--- a/press/downloads/de/Hybrid-Press-Release-de.docx
+++ b/press/downloads/de/Hybrid-Press-Release-de.docx
@@ -438,7 +438,7 @@
         </w:rPr>
         <w:t xml:space="preserve">Hybrid ist im </w:t>
       </w:r>
-      <w:hyperlink w:history="1" r:id="rIdmfgp8dar4phwcbdkvxfoa">
+      <w:hyperlink w:history="1" r:id="rId6bertd1dhdf9xburg_vrf">
         <w:r>
           <w:rPr>
             <w:rFonts w:ascii="Calibri" w:cs="Calibri" w:eastAsia="Calibri" w:hAnsi="Calibri"/>
@@ -499,7 +499,7 @@
         </w:rPr>
         <w:t xml:space="preserve"> alle Funktionen frei. Ohne Abo bleibt Hybrid ein Lesegerät für Markdown-Dokumente. Die App läuft auf macOS 13 (Ventura) oder neuer, auf Apple Silicon wie Intel, und ist in neun Sprachen verfügbar: Deutsch, Englisch, Französisch, Spanisch, Italienisch, Portugiesisch, Niederländisch, Japanisch und Chinesisch (vereinfacht). Eine Version für iPhone und iPad ist in Arbeit; der öffentliche Beta-Test über Apples TestFlight ist bereits gestartet. Wer vorab mitschreiben und Rückmeldung geben möchte, kann kostenlos teilnehmen: </w:t>
       </w:r>
-      <w:hyperlink w:history="1" r:id="rIdtpbydsrs4fpv0wf_roelj">
+      <w:hyperlink w:history="1" r:id="rIdg2lylk8m1bzz0su9hsvj5">
         <w:r>
           <w:rPr>
             <w:rFonts w:ascii="Calibri" w:cs="Calibri" w:eastAsia="Calibri" w:hAnsi="Calibri"/>
@@ -596,7 +596,7 @@
         </w:rPr>
         <w:t xml:space="preserve">E-Mail: </w:t>
       </w:r>
-      <w:hyperlink w:history="1" r:id="rId-v9nuk8z1maf1rmecnuv5">
+      <w:hyperlink w:history="1" r:id="rIdayh8hij4at-1r7lzyuaju">
         <w:r>
           <w:rPr>
             <w:rFonts w:ascii="Calibri" w:cs="Calibri" w:eastAsia="Calibri" w:hAnsi="Calibri"/>
@@ -622,7 +622,7 @@
         </w:rPr>
         <w:t xml:space="preserve">Web: </w:t>
       </w:r>
-      <w:hyperlink w:history="1" r:id="rIdsj0l2edxrfrfc_exouoks">
+      <w:hyperlink w:history="1" r:id="rIdjz2rznv204gtdnndixnyx">
         <w:r>
           <w:rPr>
             <w:rFonts w:ascii="Calibri" w:cs="Calibri" w:eastAsia="Calibri" w:hAnsi="Calibri"/>
@@ -632,6 +632,32 @@
             <w:u w:val="single"/>
           </w:rPr>
           <w:t xml:space="preserve">hybrid-editor.com</w:t>
+        </w:r>
+      </w:hyperlink>
+    </w:p>
+    <w:p>
+      <w:pPr>
+        <w:spacing w:after="200" w:line="276"/>
+      </w:pPr>
+      <w:r>
+        <w:rPr>
+          <w:rFonts w:ascii="Calibri" w:cs="Calibri" w:eastAsia="Calibri" w:hAnsi="Calibri"/>
+          <w:color w:val="292423"/>
+          <w:sz w:val="22"/>
+          <w:szCs w:val="22"/>
+        </w:rPr>
+        <w:t xml:space="preserve">Hochauflösende (druckfähige) und weboptimierte Screenshots stehen auf der Website zum Download bereit: </w:t>
+      </w:r>
+      <w:hyperlink w:history="1" r:id="rIdmbujs5jtculrqu7jqjls_">
+        <w:r>
+          <w:rPr>
+            <w:rFonts w:ascii="Calibri" w:cs="Calibri" w:eastAsia="Calibri" w:hAnsi="Calibri"/>
+            <w:color w:val="B45208"/>
+            <w:sz w:val="22"/>
+            <w:szCs w:val="22"/>
+            <w:u w:val="single"/>
+          </w:rPr>
+          <w:t xml:space="preserve">hybrid-editor.com/de/press/hybrid-1-0/</w:t>
         </w:r>
       </w:hyperlink>
     </w:p>

</xml_diff>